<commit_message>
fix(ZAC-78): keep release image gate explicit
</commit_message>
<xml_diff>
--- a/docs/handbook/USER_HANDBOOK.en.docx
+++ b/docs/handbook/USER_HANDBOOK.en.docx
@@ -17431,7 +17431,7 @@
               <w:rPr>
                 <w:rStyle w:val="VerbatimChar"/>
               </w:rPr>
-              <w:t xml:space="preserve">ghcr.io/tzu-huang/healthcare-lab:1.0.0</w:t>
+              <w:t xml:space="preserve">Pinned by the release bundle; confirm with config --images</w:t>
             </w:r>
           </w:p>
         </w:tc>
@@ -29738,7 +29738,7 @@
               <w:rPr>
                 <w:rStyle w:val="VerbatimChar"/>
               </w:rPr>
-              <w:t xml:space="preserve">ghcr.io/tzu-huang/healthcare-lab:1.0.0</w:t>
+              <w:t xml:space="preserve">Pinned by the release bundle; confirm with config --images</w:t>
             </w:r>
           </w:p>
         </w:tc>

</xml_diff>

<commit_message>
fix(ZAC-78): reconcile v1.1.1 handbook facts
</commit_message>
<xml_diff>
--- a/docs/handbook/USER_HANDBOOK.en.docx
+++ b/docs/handbook/USER_HANDBOOK.en.docx
@@ -16,16 +16,16 @@
         <w:pStyle w:val="BlockText"/>
       </w:pPr>
       <w:r>
-        <w:t xml:space="preserve">Document status: v1.0.0 Release Candidate draft Documentation baseline: </w:t>
-      </w:r>
-      <w:r>
-        <w:rPr>
-          <w:rStyle w:val="VerbatimChar"/>
-        </w:rPr>
-        <w:t xml:space="preserve">fd0e38f</w:t>
-      </w:r>
-      <w:r>
-        <w:t xml:space="preserve"> Last updated: 2026-07-22 This edition has not passed final publication, clean-install, or full end-to-end verification for all four protocols. Content marked “Pending RC verification” is not a final operational guarantee.</w:t>
+        <w:t xml:space="preserve">Document status: v1.1.1 released-image operator handbook Released image baseline: </w:t>
+      </w:r>
+      <w:r>
+        <w:rPr>
+          <w:rStyle w:val="VerbatimChar"/>
+        </w:rPr>
+        <w:t xml:space="preserve">54e60d0e69d25c256474d9d0a5c790b1d9b7599e</w:t>
+      </w:r>
+      <w:r>
+        <w:t xml:space="preserve"> Last updated: 2026-07-27 The v1.1.1 image has passed public publication and an isolated clean full-stack installation. Unrelated protocol, recovery, support, and physical-device boundaries remain explicit in Appendix G.</w:t>
       </w:r>
     </w:p>
     <w:bookmarkStart w:id="24" w:name="Xf202097f0c5625fc27771941bb469e7b64acd1a"/>
@@ -73,7 +73,7 @@
         <w:pStyle w:val="BodyText"/>
       </w:pPr>
       <w:r>
-        <w:t xml:space="preserve">This handbook applies to the v1.0.0 RC Docker distribution model. It excludes source builds and development setup. First-time installers should read Chapters 3–6; UI operators may begin with Chapters 7–9; protocol users may go directly to Chapters 10–13; troubleshooting begins in Chapter 14.</w:t>
+        <w:t xml:space="preserve">This handbook applies to the v1.1.1 Docker distribution model. It excludes source builds and development setup. First-time installers should read Chapters 3–6; UI operators may begin with Chapters 7–9; protocol users may go directly to Chapters 10–13; troubleshooting begins in Chapter 14.</w:t>
       </w:r>
     </w:p>
     <w:p>
@@ -266,7 +266,7 @@
         <w:pStyle w:val="FirstParagraph"/>
       </w:pPr>
       <w:r>
-        <w:t xml:space="preserve">The v1.0.0 RC support boundary is a trusted local machine or internal lab running </w:t>
+        <w:t xml:space="preserve">The v1.1.1 support boundary is a trusted local machine or internal lab running </w:t>
       </w:r>
       <w:r>
         <w:rPr>
@@ -771,7 +771,7 @@
         <w:pStyle w:val="Heading3"/>
       </w:pPr>
       <w:r>
-        <w:t xml:space="preserve">RC installation procedure</w:t>
+        <w:t xml:space="preserve">v1.1.1 installation procedure</w:t>
       </w:r>
     </w:p>
     <w:p>
@@ -782,7 +782,7 @@
         </w:numPr>
       </w:pPr>
       <w:r>
-        <w:t xml:space="preserve">Download and extract the v1.0.0 deployment bundle.</w:t>
+        <w:t xml:space="preserve">Download and extract the v1.1.1 deployment bundle.</w:t>
       </w:r>
     </w:p>
     <w:p>
@@ -1324,7 +1324,7 @@
         <w:pStyle w:val="Heading3"/>
       </w:pPr>
       <w:r>
-        <w:t xml:space="preserve">Completed RC image verification</w:t>
+        <w:t xml:space="preserve">Completed v1.1.1 image verification</w:t>
       </w:r>
     </w:p>
     <w:p>
@@ -1367,16 +1367,16 @@
         <w:pStyle w:val="BodyText"/>
       </w:pPr>
       <w:r>
-        <w:t xml:space="preserve">This validates RC image behavior. It does not validate the public pull of </w:t>
-      </w:r>
-      <w:r>
-        <w:rPr>
-          <w:rStyle w:val="VerbatimChar"/>
-        </w:rPr>
-        <w:t xml:space="preserve">ghcr.io/tzu-huang/healthcare-lab:1.0.0</w:t>
-      </w:r>
-      <w:r>
-        <w:t xml:space="preserve"> or a clean full-stack installation.</w:t>
+        <w:t xml:space="preserve">Release workflow 30242203066 and the isolated full-stack run validate anonymous public pull, immutable readiness, and clean installation of </w:t>
+      </w:r>
+      <w:r>
+        <w:rPr>
+          <w:rStyle w:val="VerbatimChar"/>
+        </w:rPr>
+        <w:t xml:space="preserve">ghcr.io/tzu-huang/healthcare-lab:1.1.1</w:t>
+      </w:r>
+      <w:r>
+        <w:t xml:space="preserve"> on linux/amd64.</w:t>
       </w:r>
     </w:p>
     <w:p>
@@ -1384,16 +1384,16 @@
         <w:pStyle w:val="BlockText"/>
       </w:pPr>
       <w:r>
-        <w:t xml:space="preserve">Pending RC verification: the </w:t>
-      </w:r>
-      <w:r>
-        <w:rPr>
-          <w:rStyle w:val="VerbatimChar"/>
-        </w:rPr>
-        <w:t xml:space="preserve">v1.0.0</w:t>
-      </w:r>
-      <w:r>
-        <w:t xml:space="preserve"> tag, unauthenticated public pull, image digest, clean installation, and first-time initialization.</w:t>
+        <w:t xml:space="preserve">Completed release verification: the </w:t>
+      </w:r>
+      <w:r>
+        <w:rPr>
+          <w:rStyle w:val="VerbatimChar"/>
+        </w:rPr>
+        <w:t xml:space="preserve">v1.1.1</w:t>
+      </w:r>
+      <w:r>
+        <w:t xml:space="preserve"> tag, unauthenticated public pull, revision label, clean installation, and first-time initialization passed.</w:t>
       </w:r>
     </w:p>
     <w:p>
@@ -17431,7 +17431,7 @@
               <w:rPr>
                 <w:rStyle w:val="VerbatimChar"/>
               </w:rPr>
-              <w:t xml:space="preserve">Pinned by the release bundle; confirm with config --images</w:t>
+              <w:t xml:space="preserve">ghcr.io/tzu-huang/healthcare-lab:1.1.1</w:t>
             </w:r>
           </w:p>
         </w:tc>
@@ -29247,7 +29247,7 @@
         <w:pStyle w:val="FirstParagraph"/>
       </w:pPr>
       <w:r>
-        <w:t xml:space="preserve">Compatibility is defined by the complete release matrix, not by one component version. Replacing any pinned image, changing platform/architecture, or connecting an unverified AP/device creates a deployment outside the verified v1.0.0 RC matrix until the relevant checks in Appendix F pass.</w:t>
+        <w:t xml:space="preserve">Compatibility is defined by the complete release matrix, not by one component version. Replacing any pinned image, changing platform/architecture, or connecting an unverified AP/device creates a deployment outside the verified v1.1.1 matrix until the relevant checks in Appendix F pass.</w:t>
       </w:r>
     </w:p>
     <w:bookmarkStart w:id="150" w:name="current-release-gate"/>
@@ -29264,7 +29264,7 @@
         <w:pStyle w:val="FirstParagraph"/>
       </w:pPr>
       <w:r>
-        <w:t xml:space="preserve">The handbook is structurally complete, but the v1.0.0 operational release gate remains </w:t>
+        <w:t xml:space="preserve">The v1.1.1 image publication and isolated clean-install gate is COMPLETE. The overall operational support claim remains </w:t>
       </w:r>
       <w:r>
         <w:rPr>
@@ -29274,7 +29274,7 @@
         <w:t xml:space="preserve">BLOCKED</w:t>
       </w:r>
       <w:r>
-        <w:t xml:space="preserve">. A release owner must close the items below or explicitly narrow and approve the release claim; documentation must not silently turn an unverified item into supported behavior.</w:t>
+        <w:t xml:space="preserve"> on the unrelated boundaries listed below; documentation must not silently turn an unverified item into supported behavior.</w:t>
       </w:r>
     </w:p>
     <w:tbl>
@@ -29309,7 +29309,7 @@
               <w:pStyle w:val="Compact"/>
             </w:pPr>
             <w:r>
-              <w:t xml:space="preserve">Open release evidence / defect</w:t>
+              <w:t xml:space="preserve">Status / remaining evidence</w:t>
             </w:r>
           </w:p>
         </w:tc>
@@ -29333,16 +29333,16 @@
               <w:pStyle w:val="Compact"/>
             </w:pPr>
             <w:r>
-              <w:t xml:space="preserve">Create and verify the </w:t>
-            </w:r>
-            <w:r>
-              <w:rPr>
-                <w:rStyle w:val="VerbatimChar"/>
-              </w:rPr>
-              <w:t xml:space="preserve">v1.0.0</w:t>
-            </w:r>
-            <w:r>
-              <w:t xml:space="preserve"> tag, public unauthenticated pull, immutable digest, first-time initialization, and clean full-stack installation on an equivalent </w:t>
+              <w:t xml:space="preserve">Complete for </w:t>
+            </w:r>
+            <w:r>
+              <w:rPr>
+                <w:rStyle w:val="VerbatimChar"/>
+              </w:rPr>
+              <w:t xml:space="preserve">v1.1.1</w:t>
+            </w:r>
+            <w:r>
+              <w:t xml:space="preserve">: public immutable tag, anonymous pull, revision label, first-time initialization, Settings readiness, and isolated clean full-stack installation passed on </w:t>
             </w:r>
             <w:r>
               <w:rPr>
@@ -29351,7 +29351,7 @@
               <w:t xml:space="preserve">linux/amd64</w:t>
             </w:r>
             <w:r>
-              <w:t xml:space="preserve"> host.</w:t>
+              <w:t xml:space="preserve">.</w:t>
             </w:r>
           </w:p>
         </w:tc>
@@ -29700,7 +29700,7 @@
               <w:pStyle w:val="Compact"/>
             </w:pPr>
             <w:r>
-              <w:t xml:space="preserve">v1.0.0 RC contract</w:t>
+              <w:t xml:space="preserve">v1.1.1 contract</w:t>
             </w:r>
           </w:p>
         </w:tc>
@@ -29749,7 +29749,7 @@
               <w:pStyle w:val="Compact"/>
             </w:pPr>
             <w:r>
-              <w:t xml:space="preserve">Immutable release tag; public pull/digest and final clean-install publication remain part of the release gate.</w:t>
+              <w:t xml:space="preserve">Immutable semantic release tag; anonymous pull, revision label, readiness smoke, and isolated clean full-stack installation passed on linux/amd64.</w:t>
             </w:r>
           </w:p>
         </w:tc>
@@ -30189,7 +30189,7 @@
         <w:rPr>
           <w:rStyle w:val="VerbatimChar"/>
         </w:rPr>
-        <w:t xml:space="preserve">1.0</w:t>
+        <w:t xml:space="preserve">1.1</w:t>
       </w:r>
       <w:r>
         <w:t xml:space="preserve">, </w:t>
@@ -30216,7 +30216,7 @@
         <w:rPr>
           <w:rStyle w:val="VerbatimChar"/>
         </w:rPr>
-        <w:t xml:space="preserve">1.0.0</w:t>
+        <w:t xml:space="preserve">1.1.1</w:t>
       </w:r>
       <w:r>
         <w:t xml:space="preserve"> release tag in a reproducible verification or rollback record. A </w:t>
@@ -30274,7 +30274,7 @@
               <w:pStyle w:val="Compact"/>
             </w:pPr>
             <w:r>
-              <w:t xml:space="preserve">v1.0.0 contract</w:t>
+              <w:t xml:space="preserve">v1.1.1 contract</w:t>
             </w:r>
           </w:p>
         </w:tc>
@@ -31771,7 +31771,7 @@
               <w:rPr>
                 <w:rStyle w:val="VerbatimChar"/>
               </w:rPr>
-              <w:t xml:space="preserve">1.0.0</w:t>
+              <w:t xml:space="preserve">1.1.1</w:t>
             </w:r>
             <w:r>
               <w:t xml:space="preserve">. Moving aliases such as </w:t>

</xml_diff>

<commit_message>
fix(ZAC-79): align handbook TLS defaults
</commit_message>
<xml_diff>
--- a/docs/handbook/USER_HANDBOOK.en.docx
+++ b/docs/handbook/USER_HANDBOOK.en.docx
@@ -20204,7 +20204,7 @@
               <w:rPr>
                 <w:rStyle w:val="VerbatimChar"/>
               </w:rPr>
-              <w:t xml:space="preserve">true</w:t>
+              <w:t xml:space="preserve">false</w:t>
             </w:r>
           </w:p>
         </w:tc>
@@ -20235,7 +20235,7 @@
               <w:t xml:space="preserve">lab-app</w:t>
             </w:r>
             <w:r>
-              <w:t xml:space="preserve">; never disable verification merely to hide a certificate error.</w:t>
+              <w:t xml:space="preserve">; when enabling TLS, enable verification and correct certificate errors rather than bypassing them.</w:t>
             </w:r>
           </w:p>
         </w:tc>

</xml_diff>